<commit_message>
Reword Stanford staff bullet to day-to-day lead supervising junior staff
Replaces the training/onboarding bullet with simpler supervisory
wording per user direction; removes remaining repetitive phrasing
from all resume formats.

Co-Authored-By: Claude Fable 5 <noreply@anthropic.com>
Claude-Session: https://claude.ai/code/session_0169jAMuBb2MVYdrJVQdr8P2
</commit_message>
<xml_diff>
--- a/tailored/ODonnell_Andrew_Resume_Stanford_RPM_200255.docx
+++ b/tailored/ODonnell_Andrew_Resume_Stanford_RPM_200255.docx
@@ -242,43 +242,43 @@
           <w:sz w:val="21"/>
           <w:szCs w:val="21"/>
         </w:rPr>
-        <w:t xml:space="preserve">Served as a day-to-day liaison between principal investigators, sponsors, and CROs on regulatory, administrative, and financial matters across concurrent NIH (federally sponsored) and industry clinical trials (Phase II-IV), supporting seamless trial execution and audit readiness.</w:t>
-      </w:r>
-    </w:p>
-    <w:p>
-      <w:pPr>
-        <w:pStyle w:val="ListParagraph"/>
-        <w:numPr>
-          <w:ilvl w:val="0"/>
-          <w:numId w:val="2"/>
-        </w:numPr>
-        <w:spacing w:after="30"/>
-      </w:pPr>
-      <w:r>
-        <w:rPr>
-          <w:rFonts w:ascii="Calibri" w:cs="Calibri" w:eastAsia="Calibri" w:hAnsi="Calibri"/>
-          <w:sz w:val="21"/>
-          <w:szCs w:val="21"/>
-        </w:rPr>
-        <w:t xml:space="preserve">Supported budgeting, billing, and feasibility management for funded studies, applying university, hospital, and sponsor requirements to day-to-day financial and operational decisions.</w:t>
-      </w:r>
-    </w:p>
-    <w:p>
-      <w:pPr>
-        <w:pStyle w:val="ListParagraph"/>
-        <w:numPr>
-          <w:ilvl w:val="0"/>
-          <w:numId w:val="2"/>
-        </w:numPr>
-        <w:spacing w:after="30"/>
-      </w:pPr>
-      <w:r>
-        <w:rPr>
-          <w:rFonts w:ascii="Calibri" w:cs="Calibri" w:eastAsia="Calibri" w:hAnsi="Calibri"/>
-          <w:sz w:val="21"/>
-          <w:szCs w:val="21"/>
-        </w:rPr>
-        <w:t xml:space="preserve">Interpreted and explained protocol, institutional, and sponsor requirements to study teams; served as the day-to-day escalation point for study procedures and documentation standards.</w:t>
+        <w:t xml:space="preserve">Served as liaison between principal investigators, sponsors, and CROs on regulatory, administrative, and financial matters across concurrent NIH (federally sponsored) and industry clinical trials (Phase II-IV), supporting seamless trial execution and audit readiness.</w:t>
+      </w:r>
+    </w:p>
+    <w:p>
+      <w:pPr>
+        <w:pStyle w:val="ListParagraph"/>
+        <w:numPr>
+          <w:ilvl w:val="0"/>
+          <w:numId w:val="2"/>
+        </w:numPr>
+        <w:spacing w:after="30"/>
+      </w:pPr>
+      <w:r>
+        <w:rPr>
+          <w:rFonts w:ascii="Calibri" w:cs="Calibri" w:eastAsia="Calibri" w:hAnsi="Calibri"/>
+          <w:sz w:val="21"/>
+          <w:szCs w:val="21"/>
+        </w:rPr>
+        <w:t xml:space="preserve">Supported budgeting, billing, and feasibility management for funded studies, applying university, hospital, and sponsor requirements to financial and operational decisions.</w:t>
+      </w:r>
+    </w:p>
+    <w:p>
+      <w:pPr>
+        <w:pStyle w:val="ListParagraph"/>
+        <w:numPr>
+          <w:ilvl w:val="0"/>
+          <w:numId w:val="2"/>
+        </w:numPr>
+        <w:spacing w:after="30"/>
+      </w:pPr>
+      <w:r>
+        <w:rPr>
+          <w:rFonts w:ascii="Calibri" w:cs="Calibri" w:eastAsia="Calibri" w:hAnsi="Calibri"/>
+          <w:sz w:val="21"/>
+          <w:szCs w:val="21"/>
+        </w:rPr>
+        <w:t xml:space="preserve">Interpreted and explained protocol, institutional, and sponsor requirements to study teams and served as the escalation point for study procedures and documentation standards.</w:t>
       </w:r>
     </w:p>
     <w:p>
@@ -314,7 +314,7 @@
           <w:sz w:val="21"/>
           <w:szCs w:val="21"/>
         </w:rPr>
-        <w:t xml:space="preserve">Trained and onboarded incoming clinical research coordinators on protocol workflows, eConsent, ePRO, and REDCap/OnCore data entry; developed study-specific training materials.</w:t>
+        <w:t xml:space="preserve">Served as day-to-day lead supervising junior staff members.</w:t>
       </w:r>
     </w:p>
     <w:p>

</xml_diff>

<commit_message>
Remove all em dashes and editorial asides from resume text
Rewrites dash constructions with plain punctuation and drops tacked-on
commentary clauses. Adds a hard style rule to CLAUDE.md banning em
dashes in resume prose.

Co-Authored-By: Claude Fable 5 <noreply@anthropic.com>
Claude-Session: https://claude.ai/code/session_0169jAMuBb2MVYdrJVQdr8P2
</commit_message>
<xml_diff>
--- a/tailored/ODonnell_Andrew_Resume_Stanford_RPM_200255.docx
+++ b/tailored/ODonnell_Andrew_Resume_Stanford_RPM_200255.docx
@@ -62,7 +62,7 @@
           <w:sz w:val="21"/>
           <w:szCs w:val="21"/>
         </w:rPr>
-        <w:t xml:space="preserve">Research operations professional with 8+ years of experience, including 4+ years within the Stanford University School of Medicine supporting sponsored projects funded by NIH and industry sponsors. Direct experience partnering with principal investigators, sponsors, and CROs on the regulatory, administrative, and financial dimensions of funded clinical trials — budgeting, billing, and feasibility management; interpretation of protocol, institutional, and sponsor requirements; and sustained audit readiness under FDA regulations (21 CFR) and ICH GCP. ACRP-Certified Project Manager with a record of advising and training research staff, driving process improvement, and communicating complex compliance requirements clearly to faculty-led teams.</w:t>
+        <w:t xml:space="preserve">Research operations professional with 8+ years of experience, including 4+ years within the Stanford University School of Medicine supporting sponsored projects funded by NIH and industry sponsors. Direct experience partnering with principal investigators, sponsors, and CROs on the regulatory, administrative, and financial dimensions of funded clinical trials, including budgeting, billing, and feasibility management; interpretation of protocol, institutional, and sponsor requirements; and sustained audit readiness under FDA regulations (21 CFR) and ICH GCP. ACRP-Certified Project Manager with a record of advising and training research staff, driving process improvement, and communicating complex compliance requirements clearly to faculty-led teams.</w:t>
       </w:r>
     </w:p>
     <w:p>
@@ -392,7 +392,7 @@
           <w:sz w:val="21"/>
           <w:szCs w:val="21"/>
         </w:rPr>
-        <w:t xml:space="preserve">Redesigned high-throughput COVID-19 testing and vaccination workflows, cutting average processing time per patient from 30 to approximately 18 minutes (40% faster) — a Lean-style process improvement delivered under intense operational pressure — and trained staff and interagency partners on the new workflows.</w:t>
+        <w:t xml:space="preserve">Redesigned high-throughput COVID-19 testing and vaccination workflows, cutting average processing time per patient from 30 to approximately 18 minutes (40% faster), and trained staff and interagency partners on the new workflows.</w:t>
       </w:r>
     </w:p>
     <w:p>
@@ -452,7 +452,7 @@
           <w:sz w:val="21"/>
           <w:szCs w:val="21"/>
         </w:rPr>
-        <w:t xml:space="preserve">Maintained 98%+ preventive-maintenance compliance across 200+ biomedical devices valued at $2M+, sustaining Joint Commission and DoD accreditation readiness — disciplined stewardship of high-value institutional assets under external regulatory scrutiny.</w:t>
+        <w:t xml:space="preserve">Maintained 98%+ preventive-maintenance compliance across 200+ biomedical devices valued at $2M+, sustaining Joint Commission and DoD accreditation readiness.</w:t>
       </w:r>
     </w:p>
     <w:p>
@@ -488,7 +488,7 @@
           <w:sz w:val="21"/>
           <w:szCs w:val="21"/>
         </w:rPr>
-        <w:t xml:space="preserve">Supervised and trained airmen in equipment maintenance and safety procedures, building cross-disciplinary teams and achieving zero equipment-related incidents — a demonstrated commitment to safety communication and safe behaviors.</w:t>
+        <w:t xml:space="preserve">Supervised and trained airmen in equipment maintenance and safety procedures, building cross-disciplinary teams and achieving zero equipment-related incidents.</w:t>
       </w:r>
     </w:p>
     <w:p>

</xml_diff>

<commit_message>
Fix served-as repetition in Stanford bullets
Co-Authored-By: Claude Fable 5 <noreply@anthropic.com>
Claude-Session: https://claude.ai/code/session_0169jAMuBb2MVYdrJVQdr8P2
</commit_message>
<xml_diff>
--- a/tailored/ODonnell_Andrew_Resume_Stanford_RPM_200255.docx
+++ b/tailored/ODonnell_Andrew_Resume_Stanford_RPM_200255.docx
@@ -242,7 +242,7 @@
           <w:sz w:val="21"/>
           <w:szCs w:val="21"/>
         </w:rPr>
-        <w:t xml:space="preserve">Served as liaison between principal investigators, sponsors, and CROs on regulatory, administrative, and financial matters across concurrent NIH (federally sponsored) and industry clinical trials (Phase II-IV), supporting seamless trial execution and audit readiness.</w:t>
+        <w:t xml:space="preserve">Acted as liaison between principal investigators, sponsors, and CROs on regulatory, administrative, and financial matters across concurrent NIH (federally sponsored) and industry clinical trials (Phase II-IV), supporting seamless trial execution and audit readiness.</w:t>
       </w:r>
     </w:p>
     <w:p>
@@ -278,7 +278,7 @@
           <w:sz w:val="21"/>
           <w:szCs w:val="21"/>
         </w:rPr>
-        <w:t xml:space="preserve">Interpreted and explained protocol, institutional, and sponsor requirements to study teams and served as the escalation point for study procedures and documentation standards.</w:t>
+        <w:t xml:space="preserve">Interpreted and explained protocol, institutional, and sponsor requirements to study teams and was the escalation point for study procedures and documentation standards.</w:t>
       </w:r>
     </w:p>
     <w:p>

</xml_diff>